<commit_message>
Case-study maps and supporting figures for all six papers; study-area sections and deeper discussion
Co-Authored-By: Claude Opus 5.5 <noreply@anthropic.com>
</commit_message>
<xml_diff>
--- a/paper/P0_flood_catalogue_data_paper.docx
+++ b/paper/P0_flood_catalogue_data_paper.docx
@@ -356,16 +356,34 @@
       </w:r>
     </w:p>
     <w:bookmarkEnd w:id="10"/>
-    <w:bookmarkStart w:id="16" w:name="methods"/>
+    <w:bookmarkStart w:id="11" w:name="study-area"/>
     <w:p>
       <w:pPr>
         <w:pStyle w:val="Heading1"/>
       </w:pPr>
       <w:r>
+        <w:t xml:space="preserve">Study area</w:t>
+      </w:r>
+    </w:p>
+    <w:p>
+      <w:pPr>
+        <w:pStyle w:val="FirstParagraph"/>
+      </w:pPr>
+      <w:r>
+        <w:t xml:space="preserve">Greater Kampala (32.45–32.72° E, 0.20–0.42° N): the 195 km² of Kampala Capital City and the most built-up parts of Wakiso district around it, drained by six main channel systems to Lake Victoria and the Mayanja river (Paper 1). The catalogue’s 31 distinct places lie on the Lubigi, Nakivubo and Kinawataka systems above all; 23 are inside the KCCA boundary (Fig. cm0).</w:t>
+      </w:r>
+    </w:p>
+    <w:bookmarkEnd w:id="11"/>
+    <w:bookmarkStart w:id="17" w:name="methods"/>
+    <w:p>
+      <w:pPr>
+        <w:pStyle w:val="Heading1"/>
+      </w:pPr>
+      <w:r>
         <w:t xml:space="preserve">Methods</w:t>
       </w:r>
     </w:p>
-    <w:bookmarkStart w:id="11" w:name="sources"/>
+    <w:bookmarkStart w:id="12" w:name="sources"/>
     <w:p>
       <w:pPr>
         <w:pStyle w:val="Heading2"/>
@@ -530,8 +548,8 @@
         </w:tc>
       </w:tr>
     </w:tbl>
-    <w:bookmarkEnd w:id="11"/>
-    <w:bookmarkStart w:id="12" w:name="from-articles-to-events"/>
+    <w:bookmarkEnd w:id="12"/>
+    <w:bookmarkStart w:id="13" w:name="from-articles-to-events"/>
     <w:p>
       <w:pPr>
         <w:pStyle w:val="Heading2"/>
@@ -644,8 +662,8 @@
         <w:t xml:space="preserve">Events from the three streams were merged when their dates fell within 3 days. The merged record keeps the earliest date, the union of places and channels, the highest reported death toll and all sources.</w:t>
       </w:r>
     </w:p>
-    <w:bookmarkEnd w:id="12"/>
-    <w:bookmarkStart w:id="13" w:name="quality-grades"/>
+    <w:bookmarkEnd w:id="13"/>
+    <w:bookmarkStart w:id="14" w:name="quality-grades"/>
     <w:p>
       <w:pPr>
         <w:pStyle w:val="Heading2"/>
@@ -826,8 +844,8 @@
         <w:t xml:space="preserve">Grade C events are kept for completeness. They carry no rainfall attribution and should be left out of any day-level analysis.</w:t>
       </w:r>
     </w:p>
-    <w:bookmarkEnd w:id="13"/>
-    <w:bookmarkStart w:id="14" w:name="geocoding"/>
+    <w:bookmarkEnd w:id="14"/>
+    <w:bookmarkStart w:id="15" w:name="geocoding"/>
     <w:p>
       <w:pPr>
         <w:pStyle w:val="Heading2"/>
@@ -856,8 +874,8 @@
         <w:t xml:space="preserve">says the flooding was somewhere in Bwaise, not at a point.</w:t>
       </w:r>
     </w:p>
-    <w:bookmarkEnd w:id="14"/>
-    <w:bookmarkStart w:id="15" w:name="rainfall-on-the-day"/>
+    <w:bookmarkEnd w:id="15"/>
+    <w:bookmarkStart w:id="16" w:name="rainfall-on-the-day"/>
     <w:p>
       <w:pPr>
         <w:pStyle w:val="Heading2"/>
@@ -945,9 +963,9 @@
         <w:t xml:space="preserve">Both products are coarse (CHIRPS 0.05°, POWER 0.5°) and smooth out convective storms. They are included to characterise each event, not as a measured storm total.</w:t>
       </w:r>
     </w:p>
-    <w:bookmarkEnd w:id="15"/>
     <w:bookmarkEnd w:id="16"/>
-    <w:bookmarkStart w:id="19" w:name="data-records"/>
+    <w:bookmarkEnd w:id="17"/>
+    <w:bookmarkStart w:id="20" w:name="data-records"/>
     <w:p>
       <w:pPr>
         <w:pStyle w:val="Heading1"/>
@@ -1302,7 +1320,7 @@
         <w:t xml:space="preserve">(one row per event and place): event_id, place, lat, lon, location_uncertainty_m.</w:t>
       </w:r>
     </w:p>
-    <w:bookmarkStart w:id="17" w:name="summary-of-the-record"/>
+    <w:bookmarkStart w:id="18" w:name="summary-of-the-record"/>
     <w:p>
       <w:pPr>
         <w:pStyle w:val="Heading2"/>
@@ -1502,8 +1520,8 @@
         <w:t xml:space="preserve">The most-named places sit on the three systems that the hotspot study ranks highest: Bwaise and Kalerwe on the Lubigi and Nsooba, Banda and Kyambogo on the Kinawataka, and Katwe, Ndeeba and the Clock Tower on the Nakivubo (Fig. kd41).</w:t>
       </w:r>
     </w:p>
-    <w:bookmarkEnd w:id="17"/>
-    <w:bookmarkStart w:id="18" w:name="rainfall-on-flood-days"/>
+    <w:bookmarkEnd w:id="18"/>
+    <w:bookmarkStart w:id="19" w:name="rainfall-on-flood-days"/>
     <w:p>
       <w:pPr>
         <w:pStyle w:val="Heading2"/>
@@ -1699,9 +1717,9 @@
         <w:t xml:space="preserve">Some news dates are the day after the storm. Two GDELT events (3 Mar 2018, 15 Dec 2019) have near-zero rain on the listed day but wet antecedent days (18–21 mm in 3 days), which is consistent with a report published the morning after.</w:t>
       </w:r>
     </w:p>
-    <w:bookmarkEnd w:id="18"/>
     <w:bookmarkEnd w:id="19"/>
-    <w:bookmarkStart w:id="20" w:name="technical-validation"/>
+    <w:bookmarkEnd w:id="20"/>
+    <w:bookmarkStart w:id="21" w:name="technical-validation"/>
     <w:p>
       <w:pPr>
         <w:pStyle w:val="Heading1"/>
@@ -1829,6 +1847,28 @@
           <w:b/>
           <w:bCs/>
         </w:rPr>
+        <w:t xml:space="preserve">Agreement with an independent list.</w:t>
+      </w:r>
+      <w:r>
+        <w:t xml:space="preserve"> </w:t>
+      </w:r>
+      <w:r>
+        <w:t xml:space="preserve">27 of the 31 places lie within 500 m of a location on the KCCA/NEMA and press hotspot list used in Paper 1. The two lists share some press sources, so this shows consistency rather than independent confirmation, but no catalogued place falls far from a known trouble spot.</w:t>
+      </w:r>
+    </w:p>
+    <w:p>
+      <w:pPr>
+        <w:pStyle w:val="Compact"/>
+        <w:numPr>
+          <w:ilvl w:val="0"/>
+          <w:numId w:val="1004"/>
+        </w:numPr>
+      </w:pPr>
+      <w:r>
+        <w:rPr>
+          <w:b/>
+          <w:bCs/>
+        </w:rPr>
         <w:t xml:space="preserve">Coverage control.</w:t>
       </w:r>
       <w:r>
@@ -1838,8 +1878,8 @@
         <w:t xml:space="preserve">The volume of all English-language GDELT articles mentioning Kampala was retrieved by month. It fell from about 55,000 a year in 2017 to 28,000 in 2021, 9,500 in 2023 and 7,900 in 2024, so part of the 2021–2024 gap is the index itself shrinking. It is not the whole story: in 2025 and 2026, at similar or lower volume (about 6,900 a year), the index again picked up multi-outlet floods. The gap reflects both thinner indexing and floods reported locally rather than in national, indexed media. Either way, a news-based record is not a stable measuring instrument.</w:t>
       </w:r>
     </w:p>
-    <w:bookmarkEnd w:id="20"/>
-    <w:bookmarkStart w:id="21" w:name="usage-notes"/>
+    <w:bookmarkEnd w:id="21"/>
+    <w:bookmarkStart w:id="22" w:name="usage-notes"/>
     <w:p>
       <w:pPr>
         <w:pStyle w:val="Heading1"/>
@@ -1955,8 +1995,8 @@
         <w:t xml:space="preserve">The schema is deliberately simple so that agencies and residents can add to it. The Kampala Drain Watch map (gavacharles.github.io/kampala-drain-watch) collects resident flood reports with date, location and photo, which map directly onto grade B records once confirmed.</w:t>
       </w:r>
     </w:p>
-    <w:bookmarkEnd w:id="21"/>
-    <w:bookmarkStart w:id="22" w:name="limitations"/>
+    <w:bookmarkEnd w:id="22"/>
+    <w:bookmarkStart w:id="23" w:name="limitations"/>
     <w:p>
       <w:pPr>
         <w:pStyle w:val="Heading1"/>
@@ -2031,8 +2071,8 @@
         <w:t xml:space="preserve">At 22 events the catalogue is a beginning. A complete record would draw on KCCA incident logs, Uganda Red Cross response records, UNMA impact reports and the print archives of the Daily Monitor and New Vision, which hold the pre-2017 years.</w:t>
       </w:r>
     </w:p>
-    <w:bookmarkEnd w:id="22"/>
-    <w:bookmarkStart w:id="23" w:name="recommendation-a-city-flood-log"/>
+    <w:bookmarkEnd w:id="23"/>
+    <w:bookmarkStart w:id="24" w:name="recommendation-a-city-flood-log"/>
     <w:p>
       <w:pPr>
         <w:pStyle w:val="Heading1"/>
@@ -2049,8 +2089,8 @@
         <w:t xml:space="preserve">The 2021–2024 hole is itself a finding. Kampala’s flood record depends on whether journalists write about a flood, not on whether it happened. A minimal, official flood log would fix this at almost no cost. KCCA ward officers would record, for each flood, the date and time, the place (GPS), the depth, the roads closed and the people affected, and publish the log each quarter. Combined with sub-hourly rain gauges, that log would within a few years allow rainfall thresholds for early warning, honest trend testing, and validation of every flood model of the city.</w:t>
       </w:r>
     </w:p>
-    <w:bookmarkEnd w:id="23"/>
-    <w:bookmarkStart w:id="24" w:name="code-availability"/>
+    <w:bookmarkEnd w:id="24"/>
+    <w:bookmarkStart w:id="25" w:name="code-availability"/>
     <w:p>
       <w:pPr>
         <w:pStyle w:val="Heading1"/>
@@ -2091,8 +2131,8 @@
         <w:t xml:space="preserve">(merging, grading, geocoding, rainfall attribution, Fig. kd41). Python 3; pandas, geopandas, xarray. Data are released under CC BY 4.0. Source articles remain the property of their publishers, and only headlines, dates and URLs are redistributed.</w:t>
       </w:r>
     </w:p>
-    <w:bookmarkEnd w:id="24"/>
-    <w:bookmarkStart w:id="25" w:name="figures"/>
+    <w:bookmarkEnd w:id="25"/>
+    <w:bookmarkStart w:id="26" w:name="figures"/>
     <w:p>
       <w:pPr>
         <w:pStyle w:val="Heading1"/>
@@ -2110,11 +2150,23 @@
         </w:numPr>
       </w:pPr>
       <w:r>
+        <w:t xml:space="preserve">cm0: where Kampala’s reported floods happened (places by best grade, with the hotspot list).</w:t>
+      </w:r>
+    </w:p>
+    <w:p>
+      <w:pPr>
+        <w:pStyle w:val="Compact"/>
+        <w:numPr>
+          <w:ilvl w:val="0"/>
+          <w:numId w:val="1007"/>
+        </w:numPr>
+      </w:pPr>
+      <w:r>
         <w:t xml:space="preserve">kd41: a, timeline of events by grade, reported deaths and number of outlets, with the 2021–2024 gap shaded; b, places named in flood reports, sized by number of events, over the channel network.</w:t>
       </w:r>
     </w:p>
-    <w:bookmarkEnd w:id="25"/>
-    <w:bookmarkStart w:id="26" w:name="references"/>
+    <w:bookmarkEnd w:id="26"/>
+    <w:bookmarkStart w:id="27" w:name="references"/>
     <w:p>
       <w:pPr>
         <w:pStyle w:val="Heading1"/>
@@ -2359,7 +2411,7 @@
         <w:t xml:space="preserve">).</w:t>
       </w:r>
     </w:p>
-    <w:bookmarkEnd w:id="26"/>
+    <w:bookmarkEnd w:id="27"/>
     <w:sectPr>
       <w:footnotePr>
         <w:numRestart w:val="eachSect"/>

</xml_diff>

<commit_message>
Embed numbered, captioned figures (incl. study-area maps) in all six papers; Word files carry compressed images
Co-Authored-By: Claude Opus 5.5 <noreply@anthropic.com>
</commit_message>
<xml_diff>
--- a/paper/P0_flood_catalogue_data_paper.docx
+++ b/paper/P0_flood_catalogue_data_paper.docx
@@ -356,7 +356,7 @@
       </w:r>
     </w:p>
     <w:bookmarkEnd w:id="10"/>
-    <w:bookmarkStart w:id="11" w:name="study-area"/>
+    <w:bookmarkStart w:id="14" w:name="study-area"/>
     <w:p>
       <w:pPr>
         <w:pStyle w:val="Heading1"/>
@@ -370,11 +370,76 @@
         <w:pStyle w:val="FirstParagraph"/>
       </w:pPr>
       <w:r>
-        <w:t xml:space="preserve">Greater Kampala (32.45–32.72° E, 0.20–0.42° N): the 195 km² of Kampala Capital City and the most built-up parts of Wakiso district around it, drained by six main channel systems to Lake Victoria and the Mayanja river (Paper 1). The catalogue’s 31 distinct places lie on the Lubigi, Nakivubo and Kinawataka systems above all; 23 are inside the KCCA boundary (Fig. cm0).</w:t>
-      </w:r>
-    </w:p>
-    <w:bookmarkEnd w:id="11"/>
-    <w:bookmarkStart w:id="17" w:name="methods"/>
+        <w:t xml:space="preserve">Greater Kampala (32.45–32.72° E, 0.20–0.42° N): the 195 km² of Kampala Capital City and the most built-up parts of Wakiso district around it, drained by six main channel systems to Lake Victoria and the Mayanja river (Paper 1). The catalogue’s 31 distinct places lie on the Lubigi, Nakivubo and Kinawataka systems above all; 23 are inside the KCCA boundary (Figure 1).</w:t>
+      </w:r>
+    </w:p>
+    <w:p>
+      <w:pPr>
+        <w:pStyle w:val="CaptionedFigure"/>
+      </w:pPr>
+      <w:r>
+        <w:drawing>
+          <wp:inline>
+            <wp:extent cx="5334000" cy="4783628"/>
+            <wp:effectExtent b="0" l="0" r="0" t="0"/>
+            <wp:docPr descr="Figure 1. Study area: places named in Kampala’s 22 catalogued flood events, 2007–2026, by best record grade and number of events, with the independent KCCA/NEMA and press hotspot list." title="" id="12" name="Picture"/>
+            <a:graphic>
+              <a:graphicData uri="http://schemas.openxmlformats.org/drawingml/2006/picture">
+                <pic:pic>
+                  <pic:nvPicPr>
+                    <pic:cNvPr descr="/Users/charlesgava/uganda-rainfall-climate/figures/kampala_drainage/_docx/cm0_case_flood_catalogue.jpg" id="13" name="Picture"/>
+                    <pic:cNvPicPr>
+                      <a:picLocks noChangeArrowheads="1" noChangeAspect="1"/>
+                    </pic:cNvPicPr>
+                  </pic:nvPicPr>
+                  <pic:blipFill>
+                    <a:blip r:embed="rId11"/>
+                    <a:stretch>
+                      <a:fillRect/>
+                    </a:stretch>
+                  </pic:blipFill>
+                  <pic:spPr bwMode="auto">
+                    <a:xfrm>
+                      <a:off x="0" y="0"/>
+                      <a:ext cx="5334000" cy="4783628"/>
+                    </a:xfrm>
+                    <a:prstGeom prst="rect">
+                      <a:avLst/>
+                    </a:prstGeom>
+                    <a:noFill/>
+                    <a:ln w="9525">
+                      <a:noFill/>
+                      <a:headEnd/>
+                      <a:tailEnd/>
+                    </a:ln>
+                  </pic:spPr>
+                </pic:pic>
+              </a:graphicData>
+            </a:graphic>
+          </wp:inline>
+        </w:drawing>
+      </w:r>
+    </w:p>
+    <w:p>
+      <w:pPr>
+        <w:pStyle w:val="ImageCaption"/>
+      </w:pPr>
+      <w:r>
+        <w:rPr>
+          <w:b/>
+          <w:bCs/>
+        </w:rPr>
+        <w:t xml:space="preserve">Figure 1.</w:t>
+      </w:r>
+      <w:r>
+        <w:t xml:space="preserve"> </w:t>
+      </w:r>
+      <w:r>
+        <w:t xml:space="preserve">Study area: places named in Kampala’s 22 catalogued flood events, 2007–2026, by best record grade and number of events, with the independent KCCA/NEMA and press hotspot list.</w:t>
+      </w:r>
+    </w:p>
+    <w:bookmarkEnd w:id="14"/>
+    <w:bookmarkStart w:id="20" w:name="methods"/>
     <w:p>
       <w:pPr>
         <w:pStyle w:val="Heading1"/>
@@ -383,7 +448,7 @@
         <w:t xml:space="preserve">Methods</w:t>
       </w:r>
     </w:p>
-    <w:bookmarkStart w:id="12" w:name="sources"/>
+    <w:bookmarkStart w:id="15" w:name="sources"/>
     <w:p>
       <w:pPr>
         <w:pStyle w:val="Heading2"/>
@@ -548,8 +613,8 @@
         </w:tc>
       </w:tr>
     </w:tbl>
-    <w:bookmarkEnd w:id="12"/>
-    <w:bookmarkStart w:id="13" w:name="from-articles-to-events"/>
+    <w:bookmarkEnd w:id="15"/>
+    <w:bookmarkStart w:id="16" w:name="from-articles-to-events"/>
     <w:p>
       <w:pPr>
         <w:pStyle w:val="Heading2"/>
@@ -662,8 +727,8 @@
         <w:t xml:space="preserve">Events from the three streams were merged when their dates fell within 3 days. The merged record keeps the earliest date, the union of places and channels, the highest reported death toll and all sources.</w:t>
       </w:r>
     </w:p>
-    <w:bookmarkEnd w:id="13"/>
-    <w:bookmarkStart w:id="14" w:name="quality-grades"/>
+    <w:bookmarkEnd w:id="16"/>
+    <w:bookmarkStart w:id="17" w:name="quality-grades"/>
     <w:p>
       <w:pPr>
         <w:pStyle w:val="Heading2"/>
@@ -844,8 +909,8 @@
         <w:t xml:space="preserve">Grade C events are kept for completeness. They carry no rainfall attribution and should be left out of any day-level analysis.</w:t>
       </w:r>
     </w:p>
-    <w:bookmarkEnd w:id="14"/>
-    <w:bookmarkStart w:id="15" w:name="geocoding"/>
+    <w:bookmarkEnd w:id="17"/>
+    <w:bookmarkStart w:id="18" w:name="geocoding"/>
     <w:p>
       <w:pPr>
         <w:pStyle w:val="Heading2"/>
@@ -874,8 +939,8 @@
         <w:t xml:space="preserve">says the flooding was somewhere in Bwaise, not at a point.</w:t>
       </w:r>
     </w:p>
-    <w:bookmarkEnd w:id="15"/>
-    <w:bookmarkStart w:id="16" w:name="rainfall-on-the-day"/>
+    <w:bookmarkEnd w:id="18"/>
+    <w:bookmarkStart w:id="19" w:name="rainfall-on-the-day"/>
     <w:p>
       <w:pPr>
         <w:pStyle w:val="Heading2"/>
@@ -963,9 +1028,9 @@
         <w:t xml:space="preserve">Both products are coarse (CHIRPS 0.05°, POWER 0.5°) and smooth out convective storms. They are included to characterise each event, not as a measured storm total.</w:t>
       </w:r>
     </w:p>
-    <w:bookmarkEnd w:id="16"/>
-    <w:bookmarkEnd w:id="17"/>
-    <w:bookmarkStart w:id="20" w:name="data-records"/>
+    <w:bookmarkEnd w:id="19"/>
+    <w:bookmarkEnd w:id="20"/>
+    <w:bookmarkStart w:id="26" w:name="data-records"/>
     <w:p>
       <w:pPr>
         <w:pStyle w:val="Heading1"/>
@@ -1320,7 +1385,7 @@
         <w:t xml:space="preserve">(one row per event and place): event_id, place, lat, lon, location_uncertainty_m.</w:t>
       </w:r>
     </w:p>
-    <w:bookmarkStart w:id="18" w:name="summary-of-the-record"/>
+    <w:bookmarkStart w:id="24" w:name="summary-of-the-record"/>
     <w:p>
       <w:pPr>
         <w:pStyle w:val="Heading2"/>
@@ -1517,11 +1582,76 @@
         <w:pStyle w:val="BodyText"/>
       </w:pPr>
       <w:r>
-        <w:t xml:space="preserve">The most-named places sit on the three systems that the hotspot study ranks highest: Bwaise and Kalerwe on the Lubigi and Nsooba, Banda and Kyambogo on the Kinawataka, and Katwe, Ndeeba and the Clock Tower on the Nakivubo (Fig. kd41).</w:t>
-      </w:r>
-    </w:p>
-    <w:bookmarkEnd w:id="18"/>
-    <w:bookmarkStart w:id="19" w:name="rainfall-on-flood-days"/>
+        <w:t xml:space="preserve">The most-named places sit on the three systems that the hotspot study ranks highest: Bwaise and Kalerwe on the Lubigi and Nsooba, Banda and Kyambogo on the Kinawataka, and Katwe, Ndeeba and the Clock Tower on the Nakivubo (Figure 2).</w:t>
+      </w:r>
+    </w:p>
+    <w:p>
+      <w:pPr>
+        <w:pStyle w:val="CaptionedFigure"/>
+      </w:pPr>
+      <w:r>
+        <w:drawing>
+          <wp:inline>
+            <wp:extent cx="5334000" cy="2029344"/>
+            <wp:effectExtent b="0" l="0" r="0" t="0"/>
+            <wp:docPr descr="Figure 2. The catalogue: (a) events by date, grade, reported deaths and number of outlets, with the 2021–2024 reporting gap shaded; (b) places named in flood reports over the channel network." title="" id="22" name="Picture"/>
+            <a:graphic>
+              <a:graphicData uri="http://schemas.openxmlformats.org/drawingml/2006/picture">
+                <pic:pic>
+                  <pic:nvPicPr>
+                    <pic:cNvPr descr="/Users/charlesgava/uganda-rainfall-climate/figures/kampala_drainage/_docx/kd41_flood_catalogue.jpg" id="23" name="Picture"/>
+                    <pic:cNvPicPr>
+                      <a:picLocks noChangeArrowheads="1" noChangeAspect="1"/>
+                    </pic:cNvPicPr>
+                  </pic:nvPicPr>
+                  <pic:blipFill>
+                    <a:blip r:embed="rId21"/>
+                    <a:stretch>
+                      <a:fillRect/>
+                    </a:stretch>
+                  </pic:blipFill>
+                  <pic:spPr bwMode="auto">
+                    <a:xfrm>
+                      <a:off x="0" y="0"/>
+                      <a:ext cx="5334000" cy="2029344"/>
+                    </a:xfrm>
+                    <a:prstGeom prst="rect">
+                      <a:avLst/>
+                    </a:prstGeom>
+                    <a:noFill/>
+                    <a:ln w="9525">
+                      <a:noFill/>
+                      <a:headEnd/>
+                      <a:tailEnd/>
+                    </a:ln>
+                  </pic:spPr>
+                </pic:pic>
+              </a:graphicData>
+            </a:graphic>
+          </wp:inline>
+        </w:drawing>
+      </w:r>
+    </w:p>
+    <w:p>
+      <w:pPr>
+        <w:pStyle w:val="ImageCaption"/>
+      </w:pPr>
+      <w:r>
+        <w:rPr>
+          <w:b/>
+          <w:bCs/>
+        </w:rPr>
+        <w:t xml:space="preserve">Figure 2.</w:t>
+      </w:r>
+      <w:r>
+        <w:t xml:space="preserve"> </w:t>
+      </w:r>
+      <w:r>
+        <w:t xml:space="preserve">The catalogue: (a) events by date, grade, reported deaths and number of outlets, with the 2021–2024 reporting gap shaded; (b) places named in flood reports over the channel network.</w:t>
+      </w:r>
+    </w:p>
+    <w:bookmarkEnd w:id="24"/>
+    <w:bookmarkStart w:id="25" w:name="rainfall-on-flood-days"/>
     <w:p>
       <w:pPr>
         <w:pStyle w:val="Heading2"/>
@@ -1717,9 +1847,9 @@
         <w:t xml:space="preserve">Some news dates are the day after the storm. Two GDELT events (3 Mar 2018, 15 Dec 2019) have near-zero rain on the listed day but wet antecedent days (18–21 mm in 3 days), which is consistent with a report published the morning after.</w:t>
       </w:r>
     </w:p>
-    <w:bookmarkEnd w:id="19"/>
-    <w:bookmarkEnd w:id="20"/>
-    <w:bookmarkStart w:id="21" w:name="technical-validation"/>
+    <w:bookmarkEnd w:id="25"/>
+    <w:bookmarkEnd w:id="26"/>
+    <w:bookmarkStart w:id="27" w:name="technical-validation"/>
     <w:p>
       <w:pPr>
         <w:pStyle w:val="Heading1"/>
@@ -1878,8 +2008,8 @@
         <w:t xml:space="preserve">The volume of all English-language GDELT articles mentioning Kampala was retrieved by month. It fell from about 55,000 a year in 2017 to 28,000 in 2021, 9,500 in 2023 and 7,900 in 2024, so part of the 2021–2024 gap is the index itself shrinking. It is not the whole story: in 2025 and 2026, at similar or lower volume (about 6,900 a year), the index again picked up multi-outlet floods. The gap reflects both thinner indexing and floods reported locally rather than in national, indexed media. Either way, a news-based record is not a stable measuring instrument.</w:t>
       </w:r>
     </w:p>
-    <w:bookmarkEnd w:id="21"/>
-    <w:bookmarkStart w:id="22" w:name="usage-notes"/>
+    <w:bookmarkEnd w:id="27"/>
+    <w:bookmarkStart w:id="28" w:name="usage-notes"/>
     <w:p>
       <w:pPr>
         <w:pStyle w:val="Heading1"/>
@@ -1995,8 +2125,8 @@
         <w:t xml:space="preserve">The schema is deliberately simple so that agencies and residents can add to it. The Kampala Drain Watch map (gavacharles.github.io/kampala-drain-watch) collects resident flood reports with date, location and photo, which map directly onto grade B records once confirmed.</w:t>
       </w:r>
     </w:p>
-    <w:bookmarkEnd w:id="22"/>
-    <w:bookmarkStart w:id="23" w:name="limitations"/>
+    <w:bookmarkEnd w:id="28"/>
+    <w:bookmarkStart w:id="29" w:name="limitations"/>
     <w:p>
       <w:pPr>
         <w:pStyle w:val="Heading1"/>
@@ -2071,8 +2201,8 @@
         <w:t xml:space="preserve">At 22 events the catalogue is a beginning. A complete record would draw on KCCA incident logs, Uganda Red Cross response records, UNMA impact reports and the print archives of the Daily Monitor and New Vision, which hold the pre-2017 years.</w:t>
       </w:r>
     </w:p>
-    <w:bookmarkEnd w:id="23"/>
-    <w:bookmarkStart w:id="24" w:name="recommendation-a-city-flood-log"/>
+    <w:bookmarkEnd w:id="29"/>
+    <w:bookmarkStart w:id="30" w:name="recommendation-a-city-flood-log"/>
     <w:p>
       <w:pPr>
         <w:pStyle w:val="Heading1"/>
@@ -2089,8 +2219,8 @@
         <w:t xml:space="preserve">The 2021–2024 hole is itself a finding. Kampala’s flood record depends on whether journalists write about a flood, not on whether it happened. A minimal, official flood log would fix this at almost no cost. KCCA ward officers would record, for each flood, the date and time, the place (GPS), the depth, the roads closed and the people affected, and publish the log each quarter. Combined with sub-hourly rain gauges, that log would within a few years allow rainfall thresholds for early warning, honest trend testing, and validation of every flood model of the city.</w:t>
       </w:r>
     </w:p>
-    <w:bookmarkEnd w:id="24"/>
-    <w:bookmarkStart w:id="25" w:name="code-availability"/>
+    <w:bookmarkEnd w:id="30"/>
+    <w:bookmarkStart w:id="31" w:name="code-availability"/>
     <w:p>
       <w:pPr>
         <w:pStyle w:val="Heading1"/>
@@ -2128,17 +2258,35 @@
         <w:t xml:space="preserve"> </w:t>
       </w:r>
       <w:r>
-        <w:t xml:space="preserve">(merging, grading, geocoding, rainfall attribution, Fig. kd41). Python 3; pandas, geopandas, xarray. Data are released under CC BY 4.0. Source articles remain the property of their publishers, and only headlines, dates and URLs are redistributed.</w:t>
-      </w:r>
-    </w:p>
-    <w:bookmarkEnd w:id="25"/>
-    <w:bookmarkStart w:id="26" w:name="figures"/>
+        <w:t xml:space="preserve">(merging, grading, geocoding, rainfall attribution, Figure 2). Python 3; pandas, geopandas, xarray. Data are released under CC BY 4.0. Source articles remain the property of their publishers, and only headlines, dates and URLs are redistributed.</w:t>
+      </w:r>
+    </w:p>
+    <w:bookmarkEnd w:id="31"/>
+    <w:bookmarkStart w:id="32" w:name="figures"/>
     <w:p>
       <w:pPr>
         <w:pStyle w:val="Heading1"/>
       </w:pPr>
       <w:r>
         <w:t xml:space="preserve">Figures</w:t>
+      </w:r>
+    </w:p>
+    <w:p>
+      <w:pPr>
+        <w:pStyle w:val="FirstParagraph"/>
+      </w:pPr>
+      <w:r>
+        <w:t xml:space="preserve">Figures are embedded in the text.</w:t>
+      </w:r>
+    </w:p>
+    <w:bookmarkEnd w:id="32"/>
+    <w:bookmarkStart w:id="33" w:name="references"/>
+    <w:p>
+      <w:pPr>
+        <w:pStyle w:val="Heading1"/>
+      </w:pPr>
+      <w:r>
+        <w:t xml:space="preserve">References</w:t>
       </w:r>
     </w:p>
     <w:p>
@@ -2150,7 +2298,23 @@
         </w:numPr>
       </w:pPr>
       <w:r>
-        <w:t xml:space="preserve">cm0: where Kampala’s reported floods happened (places by best grade, with the hotspot list).</w:t>
+        <w:t xml:space="preserve">Barnolas, M. and Llasat, M. C. (2007). A flood geodatabase and its climatological applications: the case of Catalonia for the last century.</w:t>
+      </w:r>
+      <w:r>
+        <w:t xml:space="preserve"> </w:t>
+      </w:r>
+      <w:r>
+        <w:rPr>
+          <w:i/>
+          <w:iCs/>
+        </w:rPr>
+        <w:t xml:space="preserve">Natural Hazards and Earth System Sciences</w:t>
+      </w:r>
+      <w:r>
+        <w:t xml:space="preserve"> </w:t>
+      </w:r>
+      <w:r>
+        <w:t xml:space="preserve">7, 271–281.</w:t>
       </w:r>
     </w:p>
     <w:p>
@@ -2162,17 +2326,7 @@
         </w:numPr>
       </w:pPr>
       <w:r>
-        <w:t xml:space="preserve">kd41: a, timeline of events by grade, reported deaths and number of outlets, with the 2021–2024 gap shaded; b, places named in flood reports, sized by number of events, over the channel network.</w:t>
-      </w:r>
-    </w:p>
-    <w:bookmarkEnd w:id="26"/>
-    <w:bookmarkStart w:id="27" w:name="references"/>
-    <w:p>
-      <w:pPr>
-        <w:pStyle w:val="Heading1"/>
-      </w:pPr>
-      <w:r>
-        <w:t xml:space="preserve">References</w:t>
+        <w:t xml:space="preserve">Brakenridge, G. R. Global Active Archive of Large Flood Events. Dartmouth Flood Observatory, University of Colorado. floodobservatory.colorado.edu.</w:t>
       </w:r>
     </w:p>
     <w:p>
@@ -2180,11 +2334,11 @@
         <w:pStyle w:val="Compact"/>
         <w:numPr>
           <w:ilvl w:val="0"/>
-          <w:numId w:val="1008"/>
+          <w:numId w:val="1007"/>
         </w:numPr>
       </w:pPr>
       <w:r>
-        <w:t xml:space="preserve">Barnolas, M. and Llasat, M. C. (2007). A flood geodatabase and its climatological applications: the case of Catalonia for the last century.</w:t>
+        <w:t xml:space="preserve">de Bruijn, J. A., de Moel, H., Jongman, B., de Ruiter, M. C., Wagemaker, J. and Aerts, J. C. J. H. (2019). A global database of historic and real-time flood events based on social media.</w:t>
       </w:r>
       <w:r>
         <w:t xml:space="preserve"> </w:t>
@@ -2194,13 +2348,13 @@
           <w:i/>
           <w:iCs/>
         </w:rPr>
-        <w:t xml:space="preserve">Natural Hazards and Earth System Sciences</w:t>
-      </w:r>
-      <w:r>
-        <w:t xml:space="preserve"> </w:t>
-      </w:r>
-      <w:r>
-        <w:t xml:space="preserve">7, 271–281.</w:t>
+        <w:t xml:space="preserve">Scientific Data</w:t>
+      </w:r>
+      <w:r>
+        <w:t xml:space="preserve"> </w:t>
+      </w:r>
+      <w:r>
+        <w:t xml:space="preserve">6, 311. doi:10.1038/s41597-019-0326-9</w:t>
       </w:r>
     </w:p>
     <w:p>
@@ -2208,11 +2362,27 @@
         <w:pStyle w:val="Compact"/>
         <w:numPr>
           <w:ilvl w:val="0"/>
-          <w:numId w:val="1008"/>
+          <w:numId w:val="1007"/>
         </w:numPr>
       </w:pPr>
       <w:r>
-        <w:t xml:space="preserve">Brakenridge, G. R. Global Active Archive of Large Flood Events. Dartmouth Flood Observatory, University of Colorado. floodobservatory.colorado.edu.</w:t>
+        <w:t xml:space="preserve">Funk, C. et al. (2015). The climate hazards infrared precipitation with stations: a new environmental record for monitoring extremes.</w:t>
+      </w:r>
+      <w:r>
+        <w:t xml:space="preserve"> </w:t>
+      </w:r>
+      <w:r>
+        <w:rPr>
+          <w:i/>
+          <w:iCs/>
+        </w:rPr>
+        <w:t xml:space="preserve">Scientific Data</w:t>
+      </w:r>
+      <w:r>
+        <w:t xml:space="preserve"> </w:t>
+      </w:r>
+      <w:r>
+        <w:t xml:space="preserve">2, 150066. doi:10.1038/sdata.2015.66</w:t>
       </w:r>
     </w:p>
     <w:p>
@@ -2220,11 +2390,11 @@
         <w:pStyle w:val="Compact"/>
         <w:numPr>
           <w:ilvl w:val="0"/>
-          <w:numId w:val="1008"/>
+          <w:numId w:val="1007"/>
         </w:numPr>
       </w:pPr>
       <w:r>
-        <w:t xml:space="preserve">de Bruijn, J. A., de Moel, H., Jongman, B., de Ruiter, M. C., Wagemaker, J. and Aerts, J. C. J. H. (2019). A global database of historic and real-time flood events based on social media.</w:t>
+        <w:t xml:space="preserve">Gelaro, R. et al. (2017). The Modern-Era Retrospective Analysis for Research and Applications, version 2 (MERRA-2).</w:t>
       </w:r>
       <w:r>
         <w:t xml:space="preserve"> </w:t>
@@ -2234,13 +2404,13 @@
           <w:i/>
           <w:iCs/>
         </w:rPr>
-        <w:t xml:space="preserve">Scientific Data</w:t>
-      </w:r>
-      <w:r>
-        <w:t xml:space="preserve"> </w:t>
-      </w:r>
-      <w:r>
-        <w:t xml:space="preserve">6, 311. doi:10.1038/s41597-019-0326-9</w:t>
+        <w:t xml:space="preserve">Journal of Climate</w:t>
+      </w:r>
+      <w:r>
+        <w:t xml:space="preserve"> </w:t>
+      </w:r>
+      <w:r>
+        <w:t xml:space="preserve">30, 5419–5454. doi:10.1175/JCLI-D-16-0758.1</w:t>
       </w:r>
     </w:p>
     <w:p>
@@ -2248,27 +2418,11 @@
         <w:pStyle w:val="Compact"/>
         <w:numPr>
           <w:ilvl w:val="0"/>
-          <w:numId w:val="1008"/>
+          <w:numId w:val="1007"/>
         </w:numPr>
       </w:pPr>
       <w:r>
-        <w:t xml:space="preserve">Funk, C. et al. (2015). The climate hazards infrared precipitation with stations: a new environmental record for monitoring extremes.</w:t>
-      </w:r>
-      <w:r>
-        <w:t xml:space="preserve"> </w:t>
-      </w:r>
-      <w:r>
-        <w:rPr>
-          <w:i/>
-          <w:iCs/>
-        </w:rPr>
-        <w:t xml:space="preserve">Scientific Data</w:t>
-      </w:r>
-      <w:r>
-        <w:t xml:space="preserve"> </w:t>
-      </w:r>
-      <w:r>
-        <w:t xml:space="preserve">2, 150066. doi:10.1038/sdata.2015.66</w:t>
+        <w:t xml:space="preserve">Guha-Sapir, D., Below, R. and Hoyois, Ph. EM-DAT: The International Disaster Database. CRED, Université catholique de Louvain, Brussels. www.emdat.be.</w:t>
       </w:r>
     </w:p>
     <w:p>
@@ -2276,27 +2430,11 @@
         <w:pStyle w:val="Compact"/>
         <w:numPr>
           <w:ilvl w:val="0"/>
-          <w:numId w:val="1008"/>
+          <w:numId w:val="1007"/>
         </w:numPr>
       </w:pPr>
       <w:r>
-        <w:t xml:space="preserve">Gelaro, R. et al. (2017). The Modern-Era Retrospective Analysis for Research and Applications, version 2 (MERRA-2).</w:t>
-      </w:r>
-      <w:r>
-        <w:t xml:space="preserve"> </w:t>
-      </w:r>
-      <w:r>
-        <w:rPr>
-          <w:i/>
-          <w:iCs/>
-        </w:rPr>
-        <w:t xml:space="preserve">Journal of Climate</w:t>
-      </w:r>
-      <w:r>
-        <w:t xml:space="preserve"> </w:t>
-      </w:r>
-      <w:r>
-        <w:t xml:space="preserve">30, 5419–5454. doi:10.1175/JCLI-D-16-0758.1</w:t>
+        <w:t xml:space="preserve">Leetaru, K. and Schrodt, P. A. (2013). GDELT: Global data on events, location and tone, 1979–2012. Paper presented at the International Studies Association annual convention, San Francisco.</w:t>
       </w:r>
     </w:p>
     <w:p>
@@ -2304,11 +2442,27 @@
         <w:pStyle w:val="Compact"/>
         <w:numPr>
           <w:ilvl w:val="0"/>
-          <w:numId w:val="1008"/>
+          <w:numId w:val="1007"/>
         </w:numPr>
       </w:pPr>
       <w:r>
-        <w:t xml:space="preserve">Guha-Sapir, D., Below, R. and Hoyois, Ph. EM-DAT: The International Disaster Database. CRED, Université catholique de Louvain, Brussels. www.emdat.be.</w:t>
+        <w:t xml:space="preserve">Olsson, H., Mugume, S. N. and Sörensen, J. (2025). Modelling the effect of sediment and solid waste deposition on pluvial flood risk using in situ high-resolution rainfall and water level measurements.</w:t>
+      </w:r>
+      <w:r>
+        <w:t xml:space="preserve"> </w:t>
+      </w:r>
+      <w:r>
+        <w:rPr>
+          <w:i/>
+          <w:iCs/>
+        </w:rPr>
+        <w:t xml:space="preserve">Water Science &amp; Technology</w:t>
+      </w:r>
+      <w:r>
+        <w:t xml:space="preserve"> </w:t>
+      </w:r>
+      <w:r>
+        <w:t xml:space="preserve">91(6), 757–. doi:10.2166/wst.2025.039</w:t>
       </w:r>
     </w:p>
     <w:p>
@@ -2316,11 +2470,27 @@
         <w:pStyle w:val="Compact"/>
         <w:numPr>
           <w:ilvl w:val="0"/>
-          <w:numId w:val="1008"/>
+          <w:numId w:val="1007"/>
         </w:numPr>
       </w:pPr>
       <w:r>
-        <w:t xml:space="preserve">Leetaru, K. and Schrodt, P. A. (2013). GDELT: Global data on events, location and tone, 1979–2012. Paper presented at the International Studies Association annual convention, San Francisco.</w:t>
+        <w:t xml:space="preserve">Young, A., Bhattacharya, B. and Zevenbergen, C. (2021). A rainfall threshold-based approach to early warnings in urban data-scarce regions: a case study of pluvial flooding in Alexandria, Egypt.</w:t>
+      </w:r>
+      <w:r>
+        <w:t xml:space="preserve"> </w:t>
+      </w:r>
+      <w:r>
+        <w:rPr>
+          <w:i/>
+          <w:iCs/>
+        </w:rPr>
+        <w:t xml:space="preserve">Journal of Flood Risk Management</w:t>
+      </w:r>
+      <w:r>
+        <w:t xml:space="preserve"> </w:t>
+      </w:r>
+      <w:r>
+        <w:t xml:space="preserve">14(2), e12702. doi:10.1111/jfr3.12702</w:t>
       </w:r>
     </w:p>
     <w:p>
@@ -2328,90 +2498,34 @@
         <w:pStyle w:val="Compact"/>
         <w:numPr>
           <w:ilvl w:val="0"/>
-          <w:numId w:val="1008"/>
+          <w:numId w:val="1007"/>
         </w:numPr>
       </w:pPr>
       <w:r>
-        <w:t xml:space="preserve">Olsson, H., Mugume, S. N. and Sörensen, J. (2025). Modelling the effect of sediment and solid waste deposition on pluvial flood risk using in situ high-resolution rainfall and water level measurements.</w:t>
-      </w:r>
-      <w:r>
-        <w:t xml:space="preserve"> </w:t>
+        <w:t xml:space="preserve">Companion papers: 1 (</w:t>
       </w:r>
       <w:r>
         <w:rPr>
           <w:i/>
           <w:iCs/>
         </w:rPr>
-        <w:t xml:space="preserve">Water Science &amp; Technology</w:t>
-      </w:r>
-      <w:r>
-        <w:t xml:space="preserve"> </w:t>
-      </w:r>
-      <w:r>
-        <w:t xml:space="preserve">91(6), 757–. doi:10.2166/wst.2025.039</w:t>
-      </w:r>
-    </w:p>
-    <w:p>
-      <w:pPr>
-        <w:pStyle w:val="Compact"/>
-        <w:numPr>
-          <w:ilvl w:val="0"/>
-          <w:numId w:val="1008"/>
-        </w:numPr>
-      </w:pPr>
-      <w:r>
-        <w:t xml:space="preserve">Young, A., Bhattacharya, B. and Zevenbergen, C. (2021). A rainfall threshold-based approach to early warnings in urban data-scarce regions: a case study of pluvial flooding in Alexandria, Egypt.</w:t>
-      </w:r>
-      <w:r>
-        <w:t xml:space="preserve"> </w:t>
+        <w:t xml:space="preserve">Rainfall or drainage?</w:t>
+      </w:r>
+      <w:r>
+        <w:t xml:space="preserve">), 4 (</w:t>
       </w:r>
       <w:r>
         <w:rPr>
           <w:i/>
           <w:iCs/>
         </w:rPr>
-        <w:t xml:space="preserve">Journal of Flood Risk Management</w:t>
-      </w:r>
-      <w:r>
-        <w:t xml:space="preserve"> </w:t>
-      </w:r>
-      <w:r>
-        <w:t xml:space="preserve">14(2), e12702. doi:10.1111/jfr3.12702</w:t>
-      </w:r>
-    </w:p>
-    <w:p>
-      <w:pPr>
-        <w:pStyle w:val="Compact"/>
-        <w:numPr>
-          <w:ilvl w:val="0"/>
-          <w:numId w:val="1008"/>
-        </w:numPr>
-      </w:pPr>
-      <w:r>
-        <w:t xml:space="preserve">Companion papers: 1 (</w:t>
-      </w:r>
-      <w:r>
-        <w:rPr>
-          <w:i/>
-          <w:iCs/>
-        </w:rPr>
-        <w:t xml:space="preserve">Rainfall or drainage?</w:t>
-      </w:r>
-      <w:r>
-        <w:t xml:space="preserve">), 4 (</w:t>
-      </w:r>
-      <w:r>
-        <w:rPr>
-          <w:i/>
-          <w:iCs/>
-        </w:rPr>
         <w:t xml:space="preserve">Silt, not storms</w:t>
       </w:r>
       <w:r>
         <w:t xml:space="preserve">).</w:t>
       </w:r>
     </w:p>
-    <w:bookmarkEnd w:id="27"/>
+    <w:bookmarkEnd w:id="33"/>
     <w:sectPr>
       <w:footnotePr>
         <w:numRestart w:val="eachSect"/>
@@ -2759,9 +2873,6 @@
     <w:abstractNumId w:val="991"/>
   </w:num>
   <w:num w:numId="1007">
-    <w:abstractNumId w:val="991"/>
-  </w:num>
-  <w:num w:numId="1008">
     <w:abstractNumId w:val="99411"/>
     <w:lvlOverride w:ilvl="0">
       <w:startOverride w:val="1"/>

</xml_diff>